<commit_message>
docs: emphasize resource center availability rule
</commit_message>
<xml_diff>
--- a/教育局学校问卷调研应用PRD_V1.1_终版.docx
+++ b/教育局学校问卷调研应用PRD_V1.1_终版.docx
@@ -9440,6 +9440,33 @@
         <w:t>4.1 V1.1 附件另存功能需求【假设】</w:t>
       </w:r>
     </w:p>
+    <w:p>
+      <w:pPr>
+        <w:spacing w:before="120" w:after="160"/>
+        <w:ind w:left="160" w:right="160"/>
+        <w:shd w:fill="EAF8F3"/>
+        <w:pBdr>
+          <w:left w:val="single" w:sz="24" w:space="6" w:color="16A379"/>
+        </w:pBdr>
+      </w:pPr>
+      <w:r>
+        <w:rPr>
+          <w:rFonts w:ascii="Microsoft YaHei" w:hAnsi="Microsoft YaHei" w:eastAsia="微软雅黑"/>
+          <w:b/>
+          <w:color w:val="235042"/>
+          <w:sz w:val="20"/>
+        </w:rPr>
+        <w:t>资源中心能力展示前置条件【假设】：</w:t>
+      </w:r>
+      <w:r>
+        <w:rPr>
+          <w:rFonts w:ascii="Microsoft YaHei" w:hAnsi="Microsoft YaHei" w:eastAsia="微软雅黑"/>
+          <w:color w:val="235042"/>
+          <w:sz w:val="20"/>
+        </w:rPr>
+        <w:t>该条件为附件选择与另存能力的统一入口规则，PC 端和移动端必须执行相同判断；未取得明确的已开启状态时按未开启处理。</w:t>
+      </w:r>
+    </w:p>
     <w:tbl>
       <w:tblPr>
         <w:tblStyle w:val="TableGrid"/>
@@ -9600,6 +9627,7 @@
               <w:bottom w:w="90" w:type="dxa"/>
               <w:end w:w="110" w:type="dxa"/>
             </w:tcMar>
+            <w:shd w:fill="EAF8F3"/>
           </w:tcPr>
           <w:p>
             <w:pPr>
@@ -9607,7 +9635,10 @@
             </w:pPr>
             <w:r>
               <w:rPr>
-                <w:sz w:val="17"/>
+                <w:rFonts w:ascii="Microsoft YaHei" w:hAnsi="Microsoft YaHei" w:eastAsia="微软雅黑"/>
+                <w:b/>
+                <w:color w:val="087A58"/>
+                <w:sz w:val="18"/>
               </w:rPr>
               <w:t>能力控制</w:t>
             </w:r>
@@ -9623,6 +9654,7 @@
               <w:bottom w:w="90" w:type="dxa"/>
               <w:end w:w="110" w:type="dxa"/>
             </w:tcMar>
+            <w:shd w:fill="EAF8F3"/>
           </w:tcPr>
           <w:p>
             <w:pPr>
@@ -9630,9 +9662,12 @@
             </w:pPr>
             <w:r>
               <w:rPr>
-                <w:sz w:val="17"/>
-              </w:rPr>
-              <w:t>应用开通校验</w:t>
+                <w:rFonts w:ascii="Microsoft YaHei" w:hAnsi="Microsoft YaHei" w:eastAsia="微软雅黑"/>
+                <w:b/>
+                <w:color w:val="087A58"/>
+                <w:sz w:val="18"/>
+              </w:rPr>
+              <w:t>应用开通校验【前置条件】</w:t>
             </w:r>
           </w:p>
         </w:tc>
@@ -9646,6 +9681,7 @@
               <w:bottom w:w="90" w:type="dxa"/>
               <w:end w:w="110" w:type="dxa"/>
             </w:tcMar>
+            <w:shd w:fill="EAF8F3"/>
           </w:tcPr>
           <w:p>
             <w:pPr>
@@ -9653,9 +9689,10 @@
             </w:pPr>
             <w:r>
               <w:rPr>
-                <w:sz w:val="17"/>
-              </w:rPr>
-              <w:t>仅当题型为文件/图片且学校已开通资源中心时展示附件勾选、全选和另存为入口；其他题型、未开通学校及教育局端均不展示。</w:t>
+                <w:rFonts w:ascii="Microsoft YaHei" w:hAnsi="Microsoft YaHei" w:eastAsia="微软雅黑"/>
+                <w:sz w:val="18"/>
+              </w:rPr>
+              <w:t>仅当当前端为学校端、问卷调研字段为文件/图片，且页面初始化或进入统计详情时学校云平台返回资源中心应用已开启，PC 端与移动端才展示附件选择框、全选及“另存为”操作模块。教育局端、普通题型、未开通、检测失败或状态不可用时均不展示。</w:t>
             </w:r>
           </w:p>
         </w:tc>
@@ -9669,6 +9706,7 @@
               <w:bottom w:w="90" w:type="dxa"/>
               <w:end w:w="110" w:type="dxa"/>
             </w:tcMar>
+            <w:shd w:fill="EAF8F3"/>
           </w:tcPr>
           <w:p>
             <w:pPr>
@@ -9676,7 +9714,8 @@
             </w:pPr>
             <w:r>
               <w:rPr>
-                <w:sz w:val="17"/>
+                <w:rFonts w:ascii="Microsoft YaHei" w:hAnsi="Microsoft YaHei" w:eastAsia="微软雅黑"/>
+                <w:sz w:val="18"/>
               </w:rPr>
               <w:t>P0</w:t>
             </w:r>
@@ -9692,6 +9731,7 @@
               <w:bottom w:w="90" w:type="dxa"/>
               <w:end w:w="110" w:type="dxa"/>
             </w:tcMar>
+            <w:shd w:fill="EAF8F3"/>
           </w:tcPr>
           <w:p>
             <w:pPr>
@@ -9699,9 +9739,10 @@
             </w:pPr>
             <w:r>
               <w:rPr>
-                <w:sz w:val="17"/>
-              </w:rPr>
-              <w:t>仅学校端</w:t>
+                <w:rFonts w:ascii="Microsoft YaHei" w:hAnsi="Microsoft YaHei" w:eastAsia="微软雅黑"/>
+                <w:sz w:val="18"/>
+              </w:rPr>
+              <w:t>【假设】开通状态由学校云平台提供；前端隐藏不能替代服务端保存时的资源中心授权及目录写入权限复核。</w:t>
             </w:r>
           </w:p>
         </w:tc>
@@ -13213,6 +13254,33 @@
       </w:pPr>
       <w:r>
         <w:t>5.9 附件另存核心流程【假设】</w:t>
+      </w:r>
+    </w:p>
+    <w:p>
+      <w:pPr>
+        <w:spacing w:before="120" w:after="160"/>
+        <w:ind w:left="160" w:right="160"/>
+        <w:shd w:fill="EAF8F3"/>
+        <w:pBdr>
+          <w:left w:val="single" w:sz="24" w:space="6" w:color="16A379"/>
+        </w:pBdr>
+      </w:pPr>
+      <w:r>
+        <w:rPr>
+          <w:rFonts w:ascii="Microsoft YaHei" w:hAnsi="Microsoft YaHei" w:eastAsia="微软雅黑"/>
+          <w:b/>
+          <w:color w:val="235042"/>
+          <w:sz w:val="20"/>
+        </w:rPr>
+        <w:t>资源中心能力展示前置条件【假设】：</w:t>
+      </w:r>
+      <w:r>
+        <w:rPr>
+          <w:rFonts w:ascii="Microsoft YaHei" w:hAnsi="Microsoft YaHei" w:eastAsia="微软雅黑"/>
+          <w:color w:val="235042"/>
+          <w:sz w:val="20"/>
+        </w:rPr>
+        <w:t>仅当当前页面为学校端、问卷调研字段为文件/图片，且学校云平台返回资源中心应用已开启时，PC 端与移动端才展示附件选择框、全选及“另存为”操作模块；教育局端、普通题型、资源中心未开启、检测失败或状态不可用时均不展示。</w:t>
       </w:r>
     </w:p>
     <w:p>
@@ -25918,7 +25986,8 @@
             </w:pPr>
             <w:r>
               <w:rPr>
-                <w:sz w:val="17"/>
+                <w:rFonts w:ascii="Microsoft YaHei" w:hAnsi="Microsoft YaHei" w:eastAsia="微软雅黑"/>
+                <w:sz w:val="18"/>
               </w:rPr>
               <w:t>A-21</w:t>
             </w:r>
@@ -25941,7 +26010,8 @@
             </w:pPr>
             <w:r>
               <w:rPr>
-                <w:sz w:val="17"/>
+                <w:rFonts w:ascii="Microsoft YaHei" w:hAnsi="Microsoft YaHei" w:eastAsia="微软雅黑"/>
+                <w:sz w:val="18"/>
               </w:rPr>
               <w:t>能力控制</w:t>
             </w:r>
@@ -25964,9 +26034,10 @@
             </w:pPr>
             <w:r>
               <w:rPr>
-                <w:sz w:val="17"/>
-              </w:rPr>
-              <w:t>学校开通资源中心且题型为文件/图片时展示选择、全选和另存为；未开通学校及教育局端均不展示。</w:t>
+                <w:rFonts w:ascii="Microsoft YaHei" w:hAnsi="Microsoft YaHei" w:eastAsia="微软雅黑"/>
+                <w:sz w:val="18"/>
+              </w:rPr>
+              <w:t>学校 PC 端和移动端仅在文件/图片题且学校云平台返回资源中心已开启时展示附件选择框、全选及“另存为”；普通题型、未开通、检测失败、状态不可用及教育局端均不展示。</w:t>
             </w:r>
           </w:p>
         </w:tc>
@@ -25987,7 +26058,8 @@
             </w:pPr>
             <w:r>
               <w:rPr>
-                <w:sz w:val="17"/>
+                <w:rFonts w:ascii="Microsoft YaHei" w:hAnsi="Microsoft YaHei" w:eastAsia="微软雅黑"/>
+                <w:sz w:val="18"/>
               </w:rPr>
               <w:t>P0</w:t>
             </w:r>

</xml_diff>